<commit_message>
Add live site README and Pages deployment
</commit_message>
<xml_diff>
--- a/public/Omar_Tarboush_CV.docx
+++ b/public/Omar_Tarboush_CV.docx
@@ -55,7 +55,7 @@
             <w:b/>
             <w:u w:val="single"/>
           </w:rPr>
-          <w:t>https://github.com/OmarTarboush/portfolio</w:t>
+          <w:t>https://omartarboush.github.io/portfolio/</w:t>
         </w:r>
       </w:hyperlink>
     </w:p>
@@ -1239,7 +1239,7 @@
         <w:color w:val="525C6C"/>
         <w:sz w:val="14"/>
       </w:rPr>
-      <w:t>Omar Tarboush | Flutter Mobile App Developer | omartarboush191@gmail.com | https://github.com/OmarTarboush/portfolio</w:t>
+      <w:t>Omar Tarboush | Flutter Mobile App Developer | omartarboush191@gmail.com | https://omartarboush.github.io/portfolio/</w:t>
     </w:r>
   </w:p>
 </w:ftr>

</xml_diff>

<commit_message>
Correct live site label
</commit_message>
<xml_diff>
--- a/public/Omar_Tarboush_CV.docx
+++ b/public/Omar_Tarboush_CV.docx
@@ -55,7 +55,7 @@
             <w:b/>
             <w:u w:val="single"/>
           </w:rPr>
-          <w:t>https://omartarboush.github.io/portfolio/</w:t>
+          <w:t>omartarboush/portfolio</w:t>
         </w:r>
       </w:hyperlink>
     </w:p>
@@ -1239,7 +1239,7 @@
         <w:color w:val="525C6C"/>
         <w:sz w:val="14"/>
       </w:rPr>
-      <w:t>Omar Tarboush | Flutter Mobile App Developer | omartarboush191@gmail.com | https://omartarboush.github.io/portfolio/</w:t>
+      <w:t>Omar Tarboush | Flutter Mobile App Developer | omartarboush191@gmail.com | Portfolio: omartarboush/portfolio</w:t>
     </w:r>
   </w:p>
 </w:ftr>

</xml_diff>

<commit_message>
Remove CV footer contact line
</commit_message>
<xml_diff>
--- a/public/Omar_Tarboush_CV.docx
+++ b/public/Omar_Tarboush_CV.docx
@@ -1215,7 +1215,6 @@
       </w:r>
     </w:p>
     <w:sectPr>
-      <w:footerReference w:type="default" r:id="rId10"/>
       <w:pgSz w:w="12240" w:h="15840"/>
       <w:pgMar w:top="490" w:right="720" w:bottom="490" w:left="720" w:header="360" w:footer="360" w:gutter="0"/>
       <w:cols w:space="720"/>
@@ -1223,26 +1222,6 @@
     </w:sectPr>
   </w:body>
 </w:document>
-</file>
-
-<file path=word/footer1.xml><?xml version="1.0" encoding="utf-8"?>
-<w:ftr xmlns:m="http://schemas.openxmlformats.org/officeDocument/2006/math" xmlns:mc="http://schemas.openxmlformats.org/markup-compatibility/2006" xmlns:mo="http://schemas.microsoft.com/office/mac/office/2008/main" xmlns:mv="urn:schemas-microsoft-com:mac:vml" xmlns:o="urn:schemas-microsoft-com:office:office" xmlns:r="http://schemas.openxmlformats.org/officeDocument/2006/relationships" xmlns:v="urn:schemas-microsoft-com:vml" xmlns:w10="urn:schemas-microsoft-com:office:word" xmlns:w14="http://schemas.microsoft.com/office/word/2010/wordml" xmlns:w="http://schemas.openxmlformats.org/wordprocessingml/2006/main" xmlns:wne="http://schemas.microsoft.com/office/word/2006/wordml" xmlns:wp14="http://schemas.microsoft.com/office/word/2010/wordprocessingDrawing" xmlns:wp="http://schemas.openxmlformats.org/drawingml/2006/wordprocessingDrawing" xmlns:wpc="http://schemas.microsoft.com/office/word/2010/wordprocessingCanvas" xmlns:wpg="http://schemas.microsoft.com/office/word/2010/wordprocessingGroup" xmlns:wpi="http://schemas.microsoft.com/office/word/2010/wordprocessingInk" xmlns:wps="http://schemas.microsoft.com/office/word/2010/wordprocessingShape" mc:Ignorable="w14 wp14">
-  <w:p>
-    <w:pPr>
-      <w:pStyle w:val="Footer"/>
-      <w:jc w:val="center"/>
-    </w:pPr>
-    <w:r>
-      <w:rPr>
-        <w:rFonts w:ascii="Arial" w:hAnsi="Arial"/>
-        <w:b w:val="0"/>
-        <w:color w:val="525C6C"/>
-        <w:sz w:val="14"/>
-      </w:rPr>
-      <w:t>Omar Tarboush | Flutter Mobile App Developer | omartarboush191@gmail.com | Portfolio: omartarboush/portfolio</w:t>
-    </w:r>
-  </w:p>
-</w:ftr>
 </file>
 
 <file path=word/numbering.xml><?xml version="1.0" encoding="utf-8"?>

</xml_diff>

<commit_message>
Increase CV experience spacing
</commit_message>
<xml_diff>
--- a/public/Omar_Tarboush_CV.docx
+++ b/public/Omar_Tarboush_CV.docx
@@ -484,7 +484,7 @@
     <w:p>
       <w:pPr>
         <w:keepNext/>
-        <w:spacing w:before="50" w:after="0"/>
+        <w:spacing w:before="112" w:after="18"/>
       </w:pPr>
       <w:r>
         <w:rPr>
@@ -517,7 +517,7 @@
     <w:p>
       <w:pPr>
         <w:keepNext/>
-        <w:spacing w:after="10"/>
+        <w:spacing w:after="34"/>
       </w:pPr>
       <w:r>
         <w:rPr>
@@ -532,7 +532,7 @@
     <w:p>
       <w:pPr>
         <w:pStyle w:val="ListBullet"/>
-        <w:spacing w:after="8" w:line="252" w:lineRule="auto"/>
+        <w:spacing w:after="23" w:line="264" w:lineRule="auto"/>
         <w:ind w:left="317" w:hanging="173"/>
       </w:pPr>
       <w:r>
@@ -548,7 +548,7 @@
     <w:p>
       <w:pPr>
         <w:pStyle w:val="ListBullet"/>
-        <w:spacing w:after="8" w:line="252" w:lineRule="auto"/>
+        <w:spacing w:after="23" w:line="264" w:lineRule="auto"/>
         <w:ind w:left="317" w:hanging="173"/>
       </w:pPr>
       <w:r>
@@ -564,7 +564,7 @@
     <w:p>
       <w:pPr>
         <w:pStyle w:val="ListBullet"/>
-        <w:spacing w:after="8" w:line="252" w:lineRule="auto"/>
+        <w:spacing w:after="23" w:line="264" w:lineRule="auto"/>
         <w:ind w:left="317" w:hanging="173"/>
       </w:pPr>
       <w:r>
@@ -580,7 +580,7 @@
     <w:p>
       <w:pPr>
         <w:keepNext/>
-        <w:spacing w:before="50" w:after="0"/>
+        <w:spacing w:before="112" w:after="18"/>
       </w:pPr>
       <w:r>
         <w:rPr>
@@ -613,7 +613,7 @@
     <w:p>
       <w:pPr>
         <w:keepNext/>
-        <w:spacing w:after="10"/>
+        <w:spacing w:after="34"/>
       </w:pPr>
       <w:r>
         <w:rPr>
@@ -628,7 +628,7 @@
     <w:p>
       <w:pPr>
         <w:pStyle w:val="ListBullet"/>
-        <w:spacing w:after="8" w:line="252" w:lineRule="auto"/>
+        <w:spacing w:after="23" w:line="264" w:lineRule="auto"/>
         <w:ind w:left="317" w:hanging="173"/>
       </w:pPr>
       <w:r>
@@ -644,7 +644,7 @@
     <w:p>
       <w:pPr>
         <w:pStyle w:val="ListBullet"/>
-        <w:spacing w:after="8" w:line="252" w:lineRule="auto"/>
+        <w:spacing w:after="23" w:line="264" w:lineRule="auto"/>
         <w:ind w:left="317" w:hanging="173"/>
       </w:pPr>
       <w:r>
@@ -660,7 +660,7 @@
     <w:p>
       <w:pPr>
         <w:pStyle w:val="ListBullet"/>
-        <w:spacing w:after="8" w:line="252" w:lineRule="auto"/>
+        <w:spacing w:after="23" w:line="264" w:lineRule="auto"/>
         <w:ind w:left="317" w:hanging="173"/>
       </w:pPr>
       <w:r>
@@ -676,7 +676,7 @@
     <w:p>
       <w:pPr>
         <w:keepNext/>
-        <w:spacing w:before="50" w:after="0"/>
+        <w:spacing w:before="112" w:after="18"/>
       </w:pPr>
       <w:r>
         <w:rPr>
@@ -709,7 +709,7 @@
     <w:p>
       <w:pPr>
         <w:keepNext/>
-        <w:spacing w:after="10"/>
+        <w:spacing w:after="34"/>
       </w:pPr>
       <w:r>
         <w:rPr>
@@ -724,7 +724,7 @@
     <w:p>
       <w:pPr>
         <w:pStyle w:val="ListBullet"/>
-        <w:spacing w:after="8" w:line="252" w:lineRule="auto"/>
+        <w:spacing w:after="23" w:line="264" w:lineRule="auto"/>
         <w:ind w:left="317" w:hanging="173"/>
       </w:pPr>
       <w:r>
@@ -740,7 +740,7 @@
     <w:p>
       <w:pPr>
         <w:pStyle w:val="ListBullet"/>
-        <w:spacing w:after="8" w:line="252" w:lineRule="auto"/>
+        <w:spacing w:after="23" w:line="264" w:lineRule="auto"/>
         <w:ind w:left="317" w:hanging="173"/>
       </w:pPr>
       <w:r>
@@ -756,7 +756,7 @@
     <w:p>
       <w:pPr>
         <w:keepNext/>
-        <w:spacing w:before="50" w:after="0"/>
+        <w:spacing w:before="112" w:after="18"/>
       </w:pPr>
       <w:r>
         <w:rPr>
@@ -789,7 +789,7 @@
     <w:p>
       <w:pPr>
         <w:keepNext/>
-        <w:spacing w:after="10"/>
+        <w:spacing w:after="34"/>
       </w:pPr>
       <w:r>
         <w:rPr>
@@ -804,7 +804,7 @@
     <w:p>
       <w:pPr>
         <w:pStyle w:val="ListBullet"/>
-        <w:spacing w:after="8" w:line="252" w:lineRule="auto"/>
+        <w:spacing w:after="23" w:line="264" w:lineRule="auto"/>
         <w:ind w:left="317" w:hanging="173"/>
       </w:pPr>
       <w:r>
@@ -820,7 +820,7 @@
     <w:p>
       <w:pPr>
         <w:pStyle w:val="ListBullet"/>
-        <w:spacing w:after="8" w:line="252" w:lineRule="auto"/>
+        <w:spacing w:after="23" w:line="264" w:lineRule="auto"/>
         <w:ind w:left="317" w:hanging="173"/>
       </w:pPr>
       <w:r>

</xml_diff>

<commit_message>
Increase CV project spacing
</commit_message>
<xml_diff>
--- a/public/Omar_Tarboush_CV.docx
+++ b/public/Omar_Tarboush_CV.docx
@@ -851,7 +851,7 @@
     <w:p>
       <w:pPr>
         <w:keepNext/>
-        <w:spacing w:before="24" w:after="10"/>
+        <w:spacing w:before="64" w:after="18"/>
       </w:pPr>
       <w:r>
         <w:rPr>
@@ -874,7 +874,7 @@
     </w:p>
     <w:p>
       <w:pPr>
-        <w:spacing w:after="6" w:line="247" w:lineRule="auto"/>
+        <w:spacing w:after="20" w:line="257" w:lineRule="auto"/>
       </w:pPr>
       <w:r>
         <w:rPr>
@@ -888,7 +888,7 @@
     </w:p>
     <w:p>
       <w:pPr>
-        <w:spacing w:after="14"/>
+        <w:spacing w:after="40"/>
       </w:pPr>
       <w:r>
         <w:rPr>
@@ -912,7 +912,7 @@
     <w:p>
       <w:pPr>
         <w:keepNext/>
-        <w:spacing w:before="24" w:after="10"/>
+        <w:spacing w:before="64" w:after="18"/>
       </w:pPr>
       <w:r>
         <w:rPr>
@@ -935,7 +935,7 @@
     </w:p>
     <w:p>
       <w:pPr>
-        <w:spacing w:after="6" w:line="247" w:lineRule="auto"/>
+        <w:spacing w:after="20" w:line="257" w:lineRule="auto"/>
       </w:pPr>
       <w:r>
         <w:rPr>
@@ -949,7 +949,7 @@
     </w:p>
     <w:p>
       <w:pPr>
-        <w:spacing w:after="14"/>
+        <w:spacing w:after="40"/>
       </w:pPr>
       <w:r>
         <w:rPr>
@@ -973,7 +973,7 @@
     <w:p>
       <w:pPr>
         <w:keepNext/>
-        <w:spacing w:before="24" w:after="10"/>
+        <w:spacing w:before="64" w:after="18"/>
       </w:pPr>
       <w:r>
         <w:rPr>
@@ -996,7 +996,7 @@
     </w:p>
     <w:p>
       <w:pPr>
-        <w:spacing w:after="6" w:line="247" w:lineRule="auto"/>
+        <w:spacing w:after="20" w:line="257" w:lineRule="auto"/>
       </w:pPr>
       <w:r>
         <w:rPr>
@@ -1010,7 +1010,7 @@
     </w:p>
     <w:p>
       <w:pPr>
-        <w:spacing w:after="14"/>
+        <w:spacing w:after="40"/>
       </w:pPr>
       <w:r>
         <w:rPr>
@@ -1034,7 +1034,7 @@
     <w:p>
       <w:pPr>
         <w:keepNext/>
-        <w:spacing w:before="24" w:after="10"/>
+        <w:spacing w:before="64" w:after="18"/>
       </w:pPr>
       <w:r>
         <w:rPr>
@@ -1057,7 +1057,7 @@
     </w:p>
     <w:p>
       <w:pPr>
-        <w:spacing w:after="6" w:line="247" w:lineRule="auto"/>
+        <w:spacing w:after="20" w:line="257" w:lineRule="auto"/>
       </w:pPr>
       <w:r>
         <w:rPr>
@@ -1071,7 +1071,7 @@
     </w:p>
     <w:p>
       <w:pPr>
-        <w:spacing w:after="14"/>
+        <w:spacing w:after="40"/>
       </w:pPr>
       <w:r>
         <w:rPr>
@@ -1095,7 +1095,7 @@
     <w:p>
       <w:pPr>
         <w:keepNext/>
-        <w:spacing w:before="24" w:after="10"/>
+        <w:spacing w:before="64" w:after="18"/>
       </w:pPr>
       <w:r>
         <w:rPr>
@@ -1118,7 +1118,7 @@
     </w:p>
     <w:p>
       <w:pPr>
-        <w:spacing w:after="6" w:line="247" w:lineRule="auto"/>
+        <w:spacing w:after="20" w:line="257" w:lineRule="auto"/>
       </w:pPr>
       <w:r>
         <w:rPr>
@@ -1132,7 +1132,7 @@
     </w:p>
     <w:p>
       <w:pPr>
-        <w:spacing w:after="14"/>
+        <w:spacing w:after="40"/>
       </w:pPr>
       <w:r>
         <w:rPr>
@@ -1156,7 +1156,7 @@
     <w:p>
       <w:pPr>
         <w:keepNext/>
-        <w:spacing w:before="24" w:after="10"/>
+        <w:spacing w:before="64" w:after="18"/>
       </w:pPr>
       <w:r>
         <w:rPr>
@@ -1179,7 +1179,7 @@
     </w:p>
     <w:p>
       <w:pPr>
-        <w:spacing w:after="6" w:line="247" w:lineRule="auto"/>
+        <w:spacing w:after="20" w:line="257" w:lineRule="auto"/>
       </w:pPr>
       <w:r>
         <w:rPr>
@@ -1193,7 +1193,7 @@
     </w:p>
     <w:p>
       <w:pPr>
-        <w:spacing w:after="14"/>
+        <w:spacing w:after="40"/>
       </w:pPr>
       <w:r>
         <w:rPr>

</xml_diff>

<commit_message>
Increase CV section text size
</commit_message>
<xml_diff>
--- a/public/Omar_Tarboush_CV.docx
+++ b/public/Omar_Tarboush_CV.docx
@@ -181,7 +181,7 @@
           <w:rFonts w:ascii="Arial" w:hAnsi="Arial"/>
           <w:b/>
           <w:color w:val="0B75D1"/>
-          <w:sz w:val="17"/>
+          <w:sz w:val="18"/>
         </w:rPr>
         <w:t>CORE SKILLS</w:t>
       </w:r>
@@ -476,7 +476,7 @@
           <w:rFonts w:ascii="Arial" w:hAnsi="Arial"/>
           <w:b/>
           <w:color w:val="0B75D1"/>
-          <w:sz w:val="17"/>
+          <w:sz w:val="18"/>
         </w:rPr>
         <w:t>WORK EXPERIENCE</w:t>
       </w:r>
@@ -491,7 +491,7 @@
           <w:rFonts w:ascii="Arial" w:hAnsi="Arial"/>
           <w:b/>
           <w:color w:val="111827"/>
-          <w:sz w:val="17"/>
+          <w:sz w:val="18"/>
         </w:rPr>
         <w:t>Full-Time Flutter Developer</w:t>
       </w:r>
@@ -500,7 +500,7 @@
           <w:rFonts w:ascii="Arial" w:hAnsi="Arial"/>
           <w:b/>
           <w:color w:val="0B75D1"/>
-          <w:sz w:val="17"/>
+          <w:sz w:val="18"/>
         </w:rPr>
         <w:t xml:space="preserve"> | We Got Nerds</w:t>
       </w:r>
@@ -524,7 +524,7 @@
           <w:rFonts w:ascii="Arial" w:hAnsi="Arial"/>
           <w:b/>
           <w:color w:val="525C6C"/>
-          <w:sz w:val="15"/>
+          <w:sz w:val="16"/>
         </w:rPr>
         <w:t>Oct 2025 - Present</w:t>
       </w:r>
@@ -532,7 +532,7 @@
     <w:p>
       <w:pPr>
         <w:pStyle w:val="ListBullet"/>
-        <w:spacing w:after="23" w:line="264" w:lineRule="auto"/>
+        <w:spacing w:after="20" w:line="259" w:lineRule="auto"/>
         <w:ind w:left="317" w:hanging="173"/>
       </w:pPr>
       <w:r>
@@ -540,7 +540,7 @@
           <w:rFonts w:ascii="Arial" w:hAnsi="Arial"/>
           <w:b w:val="0"/>
           <w:color w:val="111827"/>
-          <w:sz w:val="16"/>
+          <w:sz w:val="17"/>
         </w:rPr>
         <w:t>Managed project timelines, delegated development tasks, and coordinated cross-functional delivery.</w:t>
       </w:r>
@@ -548,7 +548,7 @@
     <w:p>
       <w:pPr>
         <w:pStyle w:val="ListBullet"/>
-        <w:spacing w:after="23" w:line="264" w:lineRule="auto"/>
+        <w:spacing w:after="20" w:line="259" w:lineRule="auto"/>
         <w:ind w:left="317" w:hanging="173"/>
       </w:pPr>
       <w:r>
@@ -556,7 +556,7 @@
           <w:rFonts w:ascii="Arial" w:hAnsi="Arial"/>
           <w:b w:val="0"/>
           <w:color w:val="111827"/>
-          <w:sz w:val="16"/>
+          <w:sz w:val="17"/>
         </w:rPr>
         <w:t>Implemented Riverpod state management and optimized data queries for stronger app performance.</w:t>
       </w:r>
@@ -564,7 +564,7 @@
     <w:p>
       <w:pPr>
         <w:pStyle w:val="ListBullet"/>
-        <w:spacing w:after="23" w:line="264" w:lineRule="auto"/>
+        <w:spacing w:after="20" w:line="259" w:lineRule="auto"/>
         <w:ind w:left="317" w:hanging="173"/>
       </w:pPr>
       <w:r>
@@ -572,7 +572,7 @@
           <w:rFonts w:ascii="Arial" w:hAnsi="Arial"/>
           <w:b w:val="0"/>
           <w:color w:val="111827"/>
-          <w:sz w:val="16"/>
+          <w:sz w:val="17"/>
         </w:rPr>
         <w:t>Integrated Firebase Auth, Firestore, Analytics, third-party REST APIs, widget tests, and integration tests.</w:t>
       </w:r>
@@ -587,7 +587,7 @@
           <w:rFonts w:ascii="Arial" w:hAnsi="Arial"/>
           <w:b/>
           <w:color w:val="111827"/>
-          <w:sz w:val="17"/>
+          <w:sz w:val="18"/>
         </w:rPr>
         <w:t>Full-Time Flutter Developer</w:t>
       </w:r>
@@ -596,7 +596,7 @@
           <w:rFonts w:ascii="Arial" w:hAnsi="Arial"/>
           <w:b/>
           <w:color w:val="0B75D1"/>
-          <w:sz w:val="17"/>
+          <w:sz w:val="18"/>
         </w:rPr>
         <w:t xml:space="preserve"> | ANS Soft</w:t>
       </w:r>
@@ -620,7 +620,7 @@
           <w:rFonts w:ascii="Arial" w:hAnsi="Arial"/>
           <w:b/>
           <w:color w:val="525C6C"/>
-          <w:sz w:val="15"/>
+          <w:sz w:val="16"/>
         </w:rPr>
         <w:t>Aug 2023 - Oct 2025</w:t>
       </w:r>
@@ -628,7 +628,7 @@
     <w:p>
       <w:pPr>
         <w:pStyle w:val="ListBullet"/>
-        <w:spacing w:after="23" w:line="264" w:lineRule="auto"/>
+        <w:spacing w:after="20" w:line="259" w:lineRule="auto"/>
         <w:ind w:left="317" w:hanging="173"/>
       </w:pPr>
       <w:r>
@@ -636,7 +636,7 @@
           <w:rFonts w:ascii="Arial" w:hAnsi="Arial"/>
           <w:b w:val="0"/>
           <w:color w:val="111827"/>
-          <w:sz w:val="16"/>
+          <w:sz w:val="17"/>
         </w:rPr>
         <w:t>Delivered and supported production mobile applications including Aklat24 and Mapy.</w:t>
       </w:r>
@@ -644,7 +644,7 @@
     <w:p>
       <w:pPr>
         <w:pStyle w:val="ListBullet"/>
-        <w:spacing w:after="23" w:line="264" w:lineRule="auto"/>
+        <w:spacing w:after="20" w:line="259" w:lineRule="auto"/>
         <w:ind w:left="317" w:hanging="173"/>
       </w:pPr>
       <w:r>
@@ -652,7 +652,7 @@
           <w:rFonts w:ascii="Arial" w:hAnsi="Arial"/>
           <w:b w:val="0"/>
           <w:color w:val="111827"/>
-          <w:sz w:val="16"/>
+          <w:sz w:val="17"/>
         </w:rPr>
         <w:t>Led special projects, planned schedules, supervised delivery work, and maintained large-scale legacy codebases.</w:t>
       </w:r>
@@ -660,7 +660,7 @@
     <w:p>
       <w:pPr>
         <w:pStyle w:val="ListBullet"/>
-        <w:spacing w:after="23" w:line="264" w:lineRule="auto"/>
+        <w:spacing w:after="20" w:line="259" w:lineRule="auto"/>
         <w:ind w:left="317" w:hanging="173"/>
       </w:pPr>
       <w:r>
@@ -668,7 +668,7 @@
           <w:rFonts w:ascii="Arial" w:hAnsi="Arial"/>
           <w:b w:val="0"/>
           <w:color w:val="111827"/>
-          <w:sz w:val="16"/>
+          <w:sz w:val="17"/>
         </w:rPr>
         <w:t>Built GetX architectures, SQL views, Firebase Messaging, deep links, GraphQL, REST APIs, and Patrol tests.</w:t>
       </w:r>
@@ -683,7 +683,7 @@
           <w:rFonts w:ascii="Arial" w:hAnsi="Arial"/>
           <w:b/>
           <w:color w:val="111827"/>
-          <w:sz w:val="17"/>
+          <w:sz w:val="18"/>
         </w:rPr>
         <w:t>Full-Time Flutter Developer / Programming Instructor</w:t>
       </w:r>
@@ -692,7 +692,7 @@
           <w:rFonts w:ascii="Arial" w:hAnsi="Arial"/>
           <w:b/>
           <w:color w:val="0B75D1"/>
-          <w:sz w:val="17"/>
+          <w:sz w:val="18"/>
         </w:rPr>
         <w:t xml:space="preserve"> | Seba School</w:t>
       </w:r>
@@ -716,7 +716,7 @@
           <w:rFonts w:ascii="Arial" w:hAnsi="Arial"/>
           <w:b/>
           <w:color w:val="525C6C"/>
-          <w:sz w:val="15"/>
+          <w:sz w:val="16"/>
         </w:rPr>
         <w:t>Sep 2023 - Sep 2024</w:t>
       </w:r>
@@ -724,7 +724,7 @@
     <w:p>
       <w:pPr>
         <w:pStyle w:val="ListBullet"/>
-        <w:spacing w:after="23" w:line="264" w:lineRule="auto"/>
+        <w:spacing w:after="20" w:line="259" w:lineRule="auto"/>
         <w:ind w:left="317" w:hanging="173"/>
       </w:pPr>
       <w:r>
@@ -732,7 +732,7 @@
           <w:rFonts w:ascii="Arial" w:hAnsi="Arial"/>
           <w:b w:val="0"/>
           <w:color w:val="111827"/>
-          <w:sz w:val="16"/>
+          <w:sz w:val="17"/>
         </w:rPr>
         <w:t>Taught programming fundamentals with a focus on Python and practical problem solving.</w:t>
       </w:r>
@@ -740,7 +740,7 @@
     <w:p>
       <w:pPr>
         <w:pStyle w:val="ListBullet"/>
-        <w:spacing w:after="23" w:line="264" w:lineRule="auto"/>
+        <w:spacing w:after="20" w:line="259" w:lineRule="auto"/>
         <w:ind w:left="317" w:hanging="173"/>
       </w:pPr>
       <w:r>
@@ -748,7 +748,7 @@
           <w:rFonts w:ascii="Arial" w:hAnsi="Arial"/>
           <w:b w:val="0"/>
           <w:color w:val="111827"/>
-          <w:sz w:val="16"/>
+          <w:sz w:val="17"/>
         </w:rPr>
         <w:t>Organized student competitions and learning events to encourage hands-on practice.</w:t>
       </w:r>
@@ -763,7 +763,7 @@
           <w:rFonts w:ascii="Arial" w:hAnsi="Arial"/>
           <w:b/>
           <w:color w:val="111827"/>
-          <w:sz w:val="17"/>
+          <w:sz w:val="18"/>
         </w:rPr>
         <w:t>Full-Time Flutter Developer</w:t>
       </w:r>
@@ -772,7 +772,7 @@
           <w:rFonts w:ascii="Arial" w:hAnsi="Arial"/>
           <w:b/>
           <w:color w:val="0B75D1"/>
-          <w:sz w:val="17"/>
+          <w:sz w:val="18"/>
         </w:rPr>
         <w:t xml:space="preserve"> | Goma Plus</w:t>
       </w:r>
@@ -796,7 +796,7 @@
           <w:rFonts w:ascii="Arial" w:hAnsi="Arial"/>
           <w:b/>
           <w:color w:val="525C6C"/>
-          <w:sz w:val="15"/>
+          <w:sz w:val="16"/>
         </w:rPr>
         <w:t>May 2023 - Aug 2023</w:t>
       </w:r>
@@ -804,7 +804,7 @@
     <w:p>
       <w:pPr>
         <w:pStyle w:val="ListBullet"/>
-        <w:spacing w:after="23" w:line="264" w:lineRule="auto"/>
+        <w:spacing w:after="20" w:line="259" w:lineRule="auto"/>
         <w:ind w:left="317" w:hanging="173"/>
       </w:pPr>
       <w:r>
@@ -812,7 +812,7 @@
           <w:rFonts w:ascii="Arial" w:hAnsi="Arial"/>
           <w:b w:val="0"/>
           <w:color w:val="111827"/>
-          <w:sz w:val="16"/>
+          <w:sz w:val="17"/>
         </w:rPr>
         <w:t>Developed mobile apps using GetX and Firebase notifications.</w:t>
       </w:r>
@@ -820,7 +820,7 @@
     <w:p>
       <w:pPr>
         <w:pStyle w:val="ListBullet"/>
-        <w:spacing w:after="23" w:line="264" w:lineRule="auto"/>
+        <w:spacing w:after="20" w:line="259" w:lineRule="auto"/>
         <w:ind w:left="317" w:hanging="173"/>
       </w:pPr>
       <w:r>
@@ -828,7 +828,7 @@
           <w:rFonts w:ascii="Arial" w:hAnsi="Arial"/>
           <w:b w:val="0"/>
           <w:color w:val="111827"/>
-          <w:sz w:val="16"/>
+          <w:sz w:val="17"/>
         </w:rPr>
         <w:t>Created stored procedures, database views, complex queries, and REST API integrations.</w:t>
       </w:r>
@@ -843,7 +843,7 @@
           <w:rFonts w:ascii="Arial" w:hAnsi="Arial"/>
           <w:b/>
           <w:color w:val="0B75D1"/>
-          <w:sz w:val="17"/>
+          <w:sz w:val="18"/>
         </w:rPr>
         <w:t>SELECTED APPLICATIONS</w:t>
       </w:r>
@@ -851,14 +851,14 @@
     <w:p>
       <w:pPr>
         <w:keepNext/>
-        <w:spacing w:before="64" w:after="18"/>
+        <w:spacing w:before="56" w:after="15"/>
       </w:pPr>
       <w:r>
         <w:rPr>
           <w:rFonts w:ascii="Arial" w:hAnsi="Arial"/>
           <w:b/>
           <w:color w:val="111827"/>
-          <w:sz w:val="16"/>
+          <w:sz w:val="17"/>
         </w:rPr>
         <w:t>H1 SMS</w:t>
       </w:r>
@@ -867,35 +867,35 @@
           <w:rFonts w:ascii="Arial" w:hAnsi="Arial"/>
           <w:b/>
           <w:color w:val="0B75D1"/>
-          <w:sz w:val="16"/>
+          <w:sz w:val="17"/>
         </w:rPr>
         <w:t xml:space="preserve"> | Unified SMS Manager</w:t>
       </w:r>
     </w:p>
     <w:p>
       <w:pPr>
-        <w:spacing w:after="20" w:line="257" w:lineRule="auto"/>
+        <w:spacing w:after="15" w:line="252" w:lineRule="auto"/>
       </w:pPr>
       <w:r>
         <w:rPr>
           <w:rFonts w:ascii="Arial" w:hAnsi="Arial"/>
           <w:b w:val="0"/>
           <w:color w:val="111827"/>
-          <w:sz w:val="15"/>
+          <w:sz w:val="16"/>
         </w:rPr>
         <w:t>Protected SMS workspace for multiple numbers with cloud backup, PIN access, encryption, and organized message workflows.</w:t>
       </w:r>
     </w:p>
     <w:p>
       <w:pPr>
-        <w:spacing w:after="40"/>
+        <w:spacing w:after="28"/>
       </w:pPr>
       <w:r>
         <w:rPr>
           <w:rFonts w:ascii="Arial" w:hAnsi="Arial"/>
           <w:b/>
           <w:color w:val="525C6C"/>
-          <w:sz w:val="14"/>
+          <w:sz w:val="15"/>
         </w:rPr>
         <w:t>Stack: Flutter, Firebase, Encryption, Cloud backup</w:t>
       </w:r>
@@ -904,7 +904,7 @@
           <w:rFonts w:ascii="Arial" w:hAnsi="Arial"/>
           <w:b w:val="0"/>
           <w:color w:val="525C6C"/>
-          <w:sz w:val="14"/>
+          <w:sz w:val="15"/>
         </w:rPr>
         <w:t xml:space="preserve"> | Stores: Play Store, App Store</w:t>
       </w:r>
@@ -912,14 +912,14 @@
     <w:p>
       <w:pPr>
         <w:keepNext/>
-        <w:spacing w:before="64" w:after="18"/>
+        <w:spacing w:before="56" w:after="15"/>
       </w:pPr>
       <w:r>
         <w:rPr>
           <w:rFonts w:ascii="Arial" w:hAnsi="Arial"/>
           <w:b/>
           <w:color w:val="111827"/>
-          <w:sz w:val="16"/>
+          <w:sz w:val="17"/>
         </w:rPr>
         <w:t>H1 Mail</w:t>
       </w:r>
@@ -928,35 +928,35 @@
           <w:rFonts w:ascii="Arial" w:hAnsi="Arial"/>
           <w:b/>
           <w:color w:val="0B75D1"/>
-          <w:sz w:val="16"/>
+          <w:sz w:val="17"/>
         </w:rPr>
         <w:t xml:space="preserve"> | Secure Multi-Account Email</w:t>
       </w:r>
     </w:p>
     <w:p>
       <w:pPr>
-        <w:spacing w:after="20" w:line="257" w:lineRule="auto"/>
+        <w:spacing w:after="15" w:line="252" w:lineRule="auto"/>
       </w:pPr>
       <w:r>
         <w:rPr>
           <w:rFonts w:ascii="Arial" w:hAnsi="Arial"/>
           <w:b w:val="0"/>
           <w:color w:val="111827"/>
-          <w:sz w:val="15"/>
+          <w:sz w:val="16"/>
         </w:rPr>
         <w:t>Protected multi-mailbox email app with PIN login, encryption, mailbox restrictions, notification flows, and account organization.</w:t>
       </w:r>
     </w:p>
     <w:p>
       <w:pPr>
-        <w:spacing w:after="40"/>
+        <w:spacing w:after="28"/>
       </w:pPr>
       <w:r>
         <w:rPr>
           <w:rFonts w:ascii="Arial" w:hAnsi="Arial"/>
           <w:b/>
           <w:color w:val="525C6C"/>
-          <w:sz w:val="14"/>
+          <w:sz w:val="15"/>
         </w:rPr>
         <w:t>Stack: Flutter, IMAP, Firebase, Security</w:t>
       </w:r>
@@ -965,7 +965,7 @@
           <w:rFonts w:ascii="Arial" w:hAnsi="Arial"/>
           <w:b w:val="0"/>
           <w:color w:val="525C6C"/>
-          <w:sz w:val="14"/>
+          <w:sz w:val="15"/>
         </w:rPr>
         <w:t xml:space="preserve"> | Stores: Play Store, App Store</w:t>
       </w:r>
@@ -973,14 +973,14 @@
     <w:p>
       <w:pPr>
         <w:keepNext/>
-        <w:spacing w:before="64" w:after="18"/>
+        <w:spacing w:before="56" w:after="15"/>
       </w:pPr>
       <w:r>
         <w:rPr>
           <w:rFonts w:ascii="Arial" w:hAnsi="Arial"/>
           <w:b/>
           <w:color w:val="111827"/>
-          <w:sz w:val="16"/>
+          <w:sz w:val="17"/>
         </w:rPr>
         <w:t>H1 Assignment</w:t>
       </w:r>
@@ -989,35 +989,35 @@
           <w:rFonts w:ascii="Arial" w:hAnsi="Arial"/>
           <w:b/>
           <w:color w:val="0B75D1"/>
-          <w:sz w:val="16"/>
+          <w:sz w:val="17"/>
         </w:rPr>
         <w:t xml:space="preserve"> | Team Task Platform</w:t>
       </w:r>
     </w:p>
     <w:p>
       <w:pPr>
-        <w:spacing w:after="20" w:line="257" w:lineRule="auto"/>
+        <w:spacing w:after="15" w:line="252" w:lineRule="auto"/>
       </w:pPr>
       <w:r>
         <w:rPr>
           <w:rFonts w:ascii="Arial" w:hAnsi="Arial"/>
           <w:b w:val="0"/>
           <w:color w:val="111827"/>
-          <w:sz w:val="15"/>
+          <w:sz w:val="16"/>
         </w:rPr>
         <w:t>Operational team platform covering tasks, groups, meetings, role-based access, profiles, real-time updates, and search.</w:t>
       </w:r>
     </w:p>
     <w:p>
       <w:pPr>
-        <w:spacing w:after="40"/>
+        <w:spacing w:after="28"/>
       </w:pPr>
       <w:r>
         <w:rPr>
           <w:rFonts w:ascii="Arial" w:hAnsi="Arial"/>
           <w:b/>
           <w:color w:val="525C6C"/>
-          <w:sz w:val="14"/>
+          <w:sz w:val="15"/>
         </w:rPr>
         <w:t>Stack: Flutter, Firebase, RBAC, Real-time</w:t>
       </w:r>
@@ -1026,7 +1026,7 @@
           <w:rFonts w:ascii="Arial" w:hAnsi="Arial"/>
           <w:b w:val="0"/>
           <w:color w:val="525C6C"/>
-          <w:sz w:val="14"/>
+          <w:sz w:val="15"/>
         </w:rPr>
         <w:t xml:space="preserve"> | Stores: Play Store, App Store</w:t>
       </w:r>
@@ -1034,14 +1034,14 @@
     <w:p>
       <w:pPr>
         <w:keepNext/>
-        <w:spacing w:before="64" w:after="18"/>
+        <w:spacing w:before="56" w:after="15"/>
       </w:pPr>
       <w:r>
         <w:rPr>
           <w:rFonts w:ascii="Arial" w:hAnsi="Arial"/>
           <w:b/>
           <w:color w:val="111827"/>
-          <w:sz w:val="16"/>
+          <w:sz w:val="17"/>
         </w:rPr>
         <w:t>Aklat24</w:t>
       </w:r>
@@ -1050,35 +1050,35 @@
           <w:rFonts w:ascii="Arial" w:hAnsi="Arial"/>
           <w:b/>
           <w:color w:val="0B75D1"/>
-          <w:sz w:val="16"/>
+          <w:sz w:val="17"/>
         </w:rPr>
         <w:t xml:space="preserve"> | Meal-Sharing Marketplace</w:t>
       </w:r>
     </w:p>
     <w:p>
       <w:pPr>
-        <w:spacing w:after="20" w:line="257" w:lineRule="auto"/>
+        <w:spacing w:after="15" w:line="252" w:lineRule="auto"/>
       </w:pPr>
       <w:r>
         <w:rPr>
           <w:rFonts w:ascii="Arial" w:hAnsi="Arial"/>
           <w:b w:val="0"/>
           <w:color w:val="111827"/>
-          <w:sz w:val="15"/>
+          <w:sz w:val="16"/>
         </w:rPr>
         <w:t>Meal-sharing marketplace connecting meal seekers with providers to reduce food waste and support location-based discovery.</w:t>
       </w:r>
     </w:p>
     <w:p>
       <w:pPr>
-        <w:spacing w:after="40"/>
+        <w:spacing w:after="28"/>
       </w:pPr>
       <w:r>
         <w:rPr>
           <w:rFonts w:ascii="Arial" w:hAnsi="Arial"/>
           <w:b/>
           <w:color w:val="525C6C"/>
-          <w:sz w:val="14"/>
+          <w:sz w:val="15"/>
         </w:rPr>
         <w:t>Stack: Flutter, GetX, Maps, REST APIs</w:t>
       </w:r>
@@ -1087,7 +1087,7 @@
           <w:rFonts w:ascii="Arial" w:hAnsi="Arial"/>
           <w:b w:val="0"/>
           <w:color w:val="525C6C"/>
-          <w:sz w:val="14"/>
+          <w:sz w:val="15"/>
         </w:rPr>
         <w:t xml:space="preserve"> | Stores: Play Store, App Store</w:t>
       </w:r>
@@ -1095,14 +1095,14 @@
     <w:p>
       <w:pPr>
         <w:keepNext/>
-        <w:spacing w:before="64" w:after="18"/>
+        <w:spacing w:before="56" w:after="15"/>
       </w:pPr>
       <w:r>
         <w:rPr>
           <w:rFonts w:ascii="Arial" w:hAnsi="Arial"/>
           <w:b/>
           <w:color w:val="111827"/>
-          <w:sz w:val="16"/>
+          <w:sz w:val="17"/>
         </w:rPr>
         <w:t>Mapy</w:t>
       </w:r>
@@ -1111,35 +1111,35 @@
           <w:rFonts w:ascii="Arial" w:hAnsi="Arial"/>
           <w:b/>
           <w:color w:val="0B75D1"/>
-          <w:sz w:val="16"/>
+          <w:sz w:val="17"/>
         </w:rPr>
         <w:t xml:space="preserve"> | Social Location App</w:t>
       </w:r>
     </w:p>
     <w:p>
       <w:pPr>
-        <w:spacing w:after="20" w:line="257" w:lineRule="auto"/>
+        <w:spacing w:after="15" w:line="252" w:lineRule="auto"/>
       </w:pPr>
       <w:r>
         <w:rPr>
           <w:rFonts w:ascii="Arial" w:hAnsi="Arial"/>
           <w:b w:val="0"/>
           <w:color w:val="111827"/>
-          <w:sz w:val="15"/>
+          <w:sz w:val="16"/>
         </w:rPr>
         <w:t>Location-based social app with Instagram-like sharing, hidden gems discovery, maps, profile flows, and content exploration.</w:t>
       </w:r>
     </w:p>
     <w:p>
       <w:pPr>
-        <w:spacing w:after="40"/>
+        <w:spacing w:after="28"/>
       </w:pPr>
       <w:r>
         <w:rPr>
           <w:rFonts w:ascii="Arial" w:hAnsi="Arial"/>
           <w:b/>
           <w:color w:val="525C6C"/>
-          <w:sz w:val="14"/>
+          <w:sz w:val="15"/>
         </w:rPr>
         <w:t>Stack: Flutter, Google Maps, GraphQL, Firebase</w:t>
       </w:r>
@@ -1148,7 +1148,7 @@
           <w:rFonts w:ascii="Arial" w:hAnsi="Arial"/>
           <w:b w:val="0"/>
           <w:color w:val="525C6C"/>
-          <w:sz w:val="14"/>
+          <w:sz w:val="15"/>
         </w:rPr>
         <w:t xml:space="preserve"> | Stores: Play Store, App Store</w:t>
       </w:r>
@@ -1156,14 +1156,14 @@
     <w:p>
       <w:pPr>
         <w:keepNext/>
-        <w:spacing w:before="64" w:after="18"/>
+        <w:spacing w:before="56" w:after="15"/>
       </w:pPr>
       <w:r>
         <w:rPr>
           <w:rFonts w:ascii="Arial" w:hAnsi="Arial"/>
           <w:b/>
           <w:color w:val="111827"/>
-          <w:sz w:val="16"/>
+          <w:sz w:val="17"/>
         </w:rPr>
         <w:t>Wonder Beauties</w:t>
       </w:r>
@@ -1172,35 +1172,35 @@
           <w:rFonts w:ascii="Arial" w:hAnsi="Arial"/>
           <w:b/>
           <w:color w:val="0B75D1"/>
-          <w:sz w:val="16"/>
+          <w:sz w:val="17"/>
         </w:rPr>
         <w:t xml:space="preserve"> | Beauty Consultations</w:t>
       </w:r>
     </w:p>
     <w:p>
       <w:pPr>
-        <w:spacing w:after="20" w:line="257" w:lineRule="auto"/>
+        <w:spacing w:after="15" w:line="252" w:lineRule="auto"/>
       </w:pPr>
       <w:r>
         <w:rPr>
           <w:rFonts w:ascii="Arial" w:hAnsi="Arial"/>
           <w:b w:val="0"/>
           <w:color w:val="111827"/>
-          <w:sz w:val="15"/>
+          <w:sz w:val="16"/>
         </w:rPr>
         <w:t>Beauty consultation and commerce app with pharmacist/doctor consultations, personalized recommendations, and original product discovery.</w:t>
       </w:r>
     </w:p>
     <w:p>
       <w:pPr>
-        <w:spacing w:after="40"/>
+        <w:spacing w:after="28"/>
       </w:pPr>
       <w:r>
         <w:rPr>
           <w:rFonts w:ascii="Arial" w:hAnsi="Arial"/>
           <w:b/>
           <w:color w:val="525C6C"/>
-          <w:sz w:val="14"/>
+          <w:sz w:val="15"/>
         </w:rPr>
         <w:t>Stack: Flutter, Firebase, E-commerce, Consultations</w:t>
       </w:r>
@@ -1209,7 +1209,7 @@
           <w:rFonts w:ascii="Arial" w:hAnsi="Arial"/>
           <w:b w:val="0"/>
           <w:color w:val="525C6C"/>
-          <w:sz w:val="14"/>
+          <w:sz w:val="15"/>
         </w:rPr>
         <w:t xml:space="preserve"> | Stores: Play Store, App Store</w:t>
       </w:r>

</xml_diff>

<commit_message>
Make LinkedIn contact clickable
</commit_message>
<xml_diff>
--- a/public/Omar_Tarboush_CV.docx
+++ b/public/Omar_Tarboush_CV.docx
@@ -44,9 +44,30 @@
           <w:color w:val="525C6C"/>
           <w:sz w:val="15"/>
         </w:rPr>
-        <w:t xml:space="preserve">Damascus, Syria | +963 941 717 409 | omartarboush191@gmail.com | LinkedIn: Omar Tarboush | Portfolio: </w:t>
+        <w:t xml:space="preserve">Damascus, Syria | +963 941 717 409 | omartarboush191@gmail.com | LinkedIn: </w:t>
       </w:r>
       <w:hyperlink r:id="rId9">
+        <w:r>
+          <w:rPr>
+            <w:rFonts w:ascii="Arial" w:hAnsi="Arial"/>
+            <w:sz w:val="15"/>
+            <w:color w:val="0B75D1"/>
+            <w:b/>
+            <w:u w:val="single"/>
+          </w:rPr>
+          <w:t>Omar Tarboush</w:t>
+        </w:r>
+      </w:hyperlink>
+      <w:r>
+        <w:rPr>
+          <w:rFonts w:ascii="Arial" w:hAnsi="Arial"/>
+          <w:b/>
+          <w:color w:val="525C6C"/>
+          <w:sz w:val="15"/>
+        </w:rPr>
+        <w:t xml:space="preserve"> | Portfolio: </w:t>
+      </w:r>
+      <w:hyperlink r:id="rId10">
         <w:r>
           <w:rPr>
             <w:rFonts w:ascii="Arial" w:hAnsi="Arial"/>

</xml_diff>

<commit_message>
Add Ghassan Ahmad and Jeebtak projects, update CV
</commit_message>
<xml_diff>
--- a/public/Omar_Tarboush_CV.docx
+++ b/public/Omar_Tarboush_CV.docx
@@ -29,7 +29,7 @@
           <w:color w:val="0B75D1"/>
           <w:sz w:val="19"/>
         </w:rPr>
-        <w:t>Flutter Mobile App Developer | AI Graduate</w:t>
+        <w:t>Flutter Mobile &amp; Web Developer | AI Graduate</w:t>
       </w:r>
     </w:p>
     <w:p>
@@ -80,118 +80,96 @@
         </w:r>
       </w:hyperlink>
     </w:p>
-    <w:tbl>
-      <w:tblPr>
-        <w:tblW w:type="auto" w:w="0"/>
-        <w:jc w:val="center"/>
-        <w:tblLayout w:type="fixed"/>
-        <w:tblLook w:firstColumn="1" w:firstRow="1" w:lastColumn="0" w:lastRow="0" w:noHBand="0" w:noVBand="1" w:val="04A0"/>
-      </w:tblPr>
-      <w:tblGrid>
-        <w:gridCol w:w="5400"/>
-        <w:gridCol w:w="5400"/>
-      </w:tblGrid>
-      <w:tr>
-        <w:tc>
-          <w:tcPr>
-            <w:tcW w:type="dxa" w:w="6984"/>
-            <w:vAlign w:val="center"/>
-            <w:tcBorders>
-              <w:top w:val="single" w:sz="4" w:color="D9E0EA"/>
-              <w:left w:val="single" w:sz="4" w:color="D9E0EA"/>
-              <w:bottom w:val="single" w:sz="4" w:color="D9E0EA"/>
-              <w:right w:val="single" w:sz="4" w:color="D9E0EA"/>
-            </w:tcBorders>
-            <w:tcMar>
-              <w:top w:w="70" w:type="dxa"/>
-              <w:start w:w="100" w:type="dxa"/>
-              <w:bottom w:w="70" w:type="dxa"/>
-              <w:end w:w="100" w:type="dxa"/>
-            </w:tcMar>
-            <w:shd w:fill="EAF4FF"/>
-          </w:tcPr>
-          <w:p>
-            <w:pPr>
-              <w:spacing w:after="0"/>
-            </w:pPr>
-            <w:r>
-              <w:rPr>
-                <w:rFonts w:ascii="Arial" w:hAnsi="Arial"/>
-                <w:b/>
-                <w:color w:val="0B75D1"/>
-                <w:sz w:val="16"/>
-              </w:rPr>
-              <w:t>Professional Summary</w:t>
-            </w:r>
-          </w:p>
-          <w:p>
-            <w:pPr>
-              <w:spacing w:after="0" w:line="252" w:lineRule="auto"/>
-            </w:pPr>
-            <w:r>
-              <w:rPr>
-                <w:rFonts w:ascii="Arial" w:hAnsi="Arial"/>
-                <w:b w:val="0"/>
-                <w:color w:val="111827"/>
-                <w:sz w:val="16"/>
-              </w:rPr>
-              <w:t>Flutter developer and AI graduate with 4+ years of production mobile app experience and 12+ applications across the UAE, Saudi Arabia, and Syria. Strong in Flutter, Firebase, GetX, Riverpod, REST/GraphQL APIs, Google Maps, deep links, notifications, secure access, and automated testing. Delivered and maintained published apps across communication, food, beauty, task management, and location-based products.</w:t>
-            </w:r>
-          </w:p>
-        </w:tc>
-        <w:tc>
-          <w:tcPr>
-            <w:tcW w:type="dxa" w:w="3283"/>
-            <w:vAlign w:val="center"/>
-            <w:tcBorders>
-              <w:top w:val="single" w:sz="4" w:color="D9E0EA"/>
-              <w:left w:val="single" w:sz="4" w:color="D9E0EA"/>
-              <w:bottom w:val="single" w:sz="4" w:color="D9E0EA"/>
-              <w:right w:val="single" w:sz="4" w:color="D9E0EA"/>
-            </w:tcBorders>
-            <w:tcMar>
-              <w:top w:w="70" w:type="dxa"/>
-              <w:start w:w="100" w:type="dxa"/>
-              <w:bottom w:w="70" w:type="dxa"/>
-              <w:end w:w="100" w:type="dxa"/>
-            </w:tcMar>
-            <w:shd w:fill="F5F8FC"/>
-          </w:tcPr>
-          <w:p>
-            <w:pPr>
-              <w:spacing w:after="0"/>
-            </w:pPr>
-            <w:r>
-              <w:rPr>
-                <w:rFonts w:ascii="Arial" w:hAnsi="Arial"/>
-                <w:b/>
-                <w:color w:val="0B75D1"/>
-                <w:sz w:val="16"/>
-              </w:rPr>
-              <w:t>Education &amp; Languages</w:t>
-            </w:r>
-          </w:p>
-          <w:p>
-            <w:pPr>
-              <w:spacing w:after="0"/>
-            </w:pPr>
-            <w:r>
-              <w:rPr>
-                <w:rFonts w:ascii="Arial" w:hAnsi="Arial"/>
-                <w:b w:val="0"/>
-                <w:color w:val="111827"/>
-                <w:sz w:val="15"/>
-              </w:rPr>
-              <w:t>BSc Information Technology, AI Major</w:t>
-              <w:br/>
-              <w:t>Arab International University</w:t>
-              <w:br/>
-              <w:t>Arabic native | English good</w:t>
-            </w:r>
-          </w:p>
-        </w:tc>
-      </w:tr>
-    </w:tbl>
+    <w:p>
+      <w:pPr>
+        <w:keepNext/>
+        <w:spacing w:before="110" w:after="40"/>
+      </w:pPr>
+      <w:r>
+        <w:rPr>
+          <w:rFonts w:ascii="Arial" w:hAnsi="Arial"/>
+          <w:b/>
+          <w:color w:val="0B75D1"/>
+          <w:sz w:val="18"/>
+        </w:rPr>
+        <w:t>PROFESSIONAL SUMMARY</w:t>
+      </w:r>
+    </w:p>
+    <w:p>
+      <w:pPr>
+        <w:spacing w:after="24" w:line="252" w:lineRule="auto"/>
+      </w:pPr>
+      <w:r>
+        <w:rPr>
+          <w:rFonts w:ascii="Arial" w:hAnsi="Arial"/>
+          <w:b w:val="0"/>
+          <w:color w:val="111827"/>
+          <w:sz w:val="16"/>
+        </w:rPr>
+        <w:t>Flutter developer and AI graduate with 4+ years of production mobile app experience and 12+ applications across the UAE, Saudi Arabia, and Syria. Strong in Flutter, Firebase, GetX, Riverpod, BLoC, REST/GraphQL APIs, Google Maps, deep links, notifications, secure access, and Patrol automated app testing. Delivered and maintained published apps across communication, food, beauty, task management, accounting, and location-based products, plus bilingual web delivery with Next.js.</w:t>
+      </w:r>
+    </w:p>
+    <w:p>
+      <w:pPr>
+        <w:keepNext/>
+        <w:spacing w:before="110" w:after="40"/>
+      </w:pPr>
+      <w:r>
+        <w:rPr>
+          <w:rFonts w:ascii="Arial" w:hAnsi="Arial"/>
+          <w:b/>
+          <w:color w:val="0B75D1"/>
+          <w:sz w:val="18"/>
+        </w:rPr>
+        <w:t>EDUCATION &amp; LANGUAGES</w:t>
+      </w:r>
+    </w:p>
+    <w:p>
+      <w:pPr>
+        <w:spacing w:after="22" w:line="252" w:lineRule="auto"/>
+      </w:pPr>
+      <w:r>
+        <w:rPr>
+          <w:rFonts w:ascii="Arial" w:hAnsi="Arial"/>
+          <w:b/>
+          <w:color w:val="0B75D1"/>
+          <w:sz w:val="15"/>
+        </w:rPr>
+        <w:t xml:space="preserve">Education: </w:t>
+      </w:r>
+      <w:r>
+        <w:rPr>
+          <w:rFonts w:ascii="Arial" w:hAnsi="Arial"/>
+          <w:b w:val="0"/>
+          <w:color w:val="111827"/>
+          <w:sz w:val="15"/>
+        </w:rPr>
+        <w:t>BSc Information Technology, AI Major - Arab International University</w:t>
+      </w:r>
+    </w:p>
+    <w:p>
+      <w:pPr>
+        <w:spacing w:after="22" w:line="252" w:lineRule="auto"/>
+      </w:pPr>
+      <w:r>
+        <w:rPr>
+          <w:rFonts w:ascii="Arial" w:hAnsi="Arial"/>
+          <w:b/>
+          <w:color w:val="0B75D1"/>
+          <w:sz w:val="15"/>
+        </w:rPr>
+        <w:t xml:space="preserve">Languages: </w:t>
+      </w:r>
+      <w:r>
+        <w:rPr>
+          <w:rFonts w:ascii="Arial" w:hAnsi="Arial"/>
+          <w:b w:val="0"/>
+          <w:color w:val="111827"/>
+          <w:sz w:val="15"/>
+        </w:rPr>
+        <w:t>Arabic native | English good</w:t>
+      </w:r>
+    </w:p>
     <w:p>
       <w:pPr>
         <w:keepNext/>
@@ -207,286 +185,121 @@
         <w:t>CORE SKILLS</w:t>
       </w:r>
     </w:p>
-    <w:tbl>
-      <w:tblPr>
-        <w:tblW w:type="auto" w:w="0"/>
-        <w:jc w:val="center"/>
-        <w:tblLayout w:type="fixed"/>
-        <w:tblLook w:firstColumn="1" w:firstRow="1" w:lastColumn="0" w:lastRow="0" w:noHBand="0" w:noVBand="1" w:val="04A0"/>
-      </w:tblPr>
-      <w:tblGrid>
-        <w:gridCol w:w="5400"/>
-        <w:gridCol w:w="5400"/>
-      </w:tblGrid>
-      <w:tr>
-        <w:tc>
-          <w:tcPr>
-            <w:tcW w:type="dxa" w:w="2160"/>
-            <w:vAlign w:val="center"/>
-            <w:tcBorders>
-              <w:top w:val="single" w:sz="4" w:color="D9E0EA"/>
-              <w:left w:val="single" w:sz="4" w:color="D9E0EA"/>
-              <w:bottom w:val="single" w:sz="4" w:color="D9E0EA"/>
-              <w:right w:val="single" w:sz="4" w:color="D9E0EA"/>
-            </w:tcBorders>
-            <w:tcMar>
-              <w:top w:w="70" w:type="dxa"/>
-              <w:start w:w="100" w:type="dxa"/>
-              <w:bottom w:w="70" w:type="dxa"/>
-              <w:end w:w="100" w:type="dxa"/>
-            </w:tcMar>
-            <w:shd w:fill="F5F8FC"/>
-          </w:tcPr>
-          <w:p>
-            <w:pPr>
-              <w:spacing w:after="0"/>
-            </w:pPr>
-            <w:r>
-              <w:rPr>
-                <w:rFonts w:ascii="Arial" w:hAnsi="Arial"/>
-                <w:b/>
-                <w:color w:val="0B75D1"/>
-                <w:sz w:val="15"/>
-              </w:rPr>
-              <w:t>Mobile</w:t>
-            </w:r>
-          </w:p>
-        </w:tc>
-        <w:tc>
-          <w:tcPr>
-            <w:tcW w:type="dxa" w:w="7992"/>
-            <w:vAlign w:val="center"/>
-            <w:tcBorders>
-              <w:top w:val="single" w:sz="4" w:color="D9E0EA"/>
-              <w:left w:val="single" w:sz="4" w:color="D9E0EA"/>
-              <w:bottom w:val="single" w:sz="4" w:color="D9E0EA"/>
-              <w:right w:val="single" w:sz="4" w:color="D9E0EA"/>
-            </w:tcBorders>
-            <w:tcMar>
-              <w:top w:w="70" w:type="dxa"/>
-              <w:start w:w="100" w:type="dxa"/>
-              <w:bottom w:w="70" w:type="dxa"/>
-              <w:end w:w="100" w:type="dxa"/>
-            </w:tcMar>
-          </w:tcPr>
-          <w:p>
-            <w:pPr>
-              <w:spacing w:after="0"/>
-            </w:pPr>
-            <w:r>
-              <w:rPr>
-                <w:rFonts w:ascii="Arial" w:hAnsi="Arial"/>
-                <w:b w:val="0"/>
-                <w:color w:val="111827"/>
-                <w:sz w:val="15"/>
-              </w:rPr>
-              <w:t>Flutter, Dart, GetX, Riverpod, Patrol, Mockito, widget and integration testing</w:t>
-            </w:r>
-          </w:p>
-        </w:tc>
-      </w:tr>
-      <w:tr>
-        <w:tc>
-          <w:tcPr>
-            <w:tcW w:type="dxa" w:w="2160"/>
-            <w:vAlign w:val="center"/>
-            <w:tcBorders>
-              <w:top w:val="single" w:sz="4" w:color="D9E0EA"/>
-              <w:left w:val="single" w:sz="4" w:color="D9E0EA"/>
-              <w:bottom w:val="single" w:sz="4" w:color="D9E0EA"/>
-              <w:right w:val="single" w:sz="4" w:color="D9E0EA"/>
-            </w:tcBorders>
-            <w:tcMar>
-              <w:top w:w="70" w:type="dxa"/>
-              <w:start w:w="100" w:type="dxa"/>
-              <w:bottom w:w="70" w:type="dxa"/>
-              <w:end w:w="100" w:type="dxa"/>
-            </w:tcMar>
-            <w:shd w:fill="F5F8FC"/>
-          </w:tcPr>
-          <w:p>
-            <w:pPr>
-              <w:spacing w:after="0"/>
-            </w:pPr>
-            <w:r>
-              <w:rPr>
-                <w:rFonts w:ascii="Arial" w:hAnsi="Arial"/>
-                <w:b/>
-                <w:color w:val="0B75D1"/>
-                <w:sz w:val="15"/>
-              </w:rPr>
-              <w:t>Backend/Data</w:t>
-            </w:r>
-          </w:p>
-        </w:tc>
-        <w:tc>
-          <w:tcPr>
-            <w:tcW w:type="dxa" w:w="7992"/>
-            <w:vAlign w:val="center"/>
-            <w:tcBorders>
-              <w:top w:val="single" w:sz="4" w:color="D9E0EA"/>
-              <w:left w:val="single" w:sz="4" w:color="D9E0EA"/>
-              <w:bottom w:val="single" w:sz="4" w:color="D9E0EA"/>
-              <w:right w:val="single" w:sz="4" w:color="D9E0EA"/>
-            </w:tcBorders>
-            <w:tcMar>
-              <w:top w:w="70" w:type="dxa"/>
-              <w:start w:w="100" w:type="dxa"/>
-              <w:bottom w:w="70" w:type="dxa"/>
-              <w:end w:w="100" w:type="dxa"/>
-            </w:tcMar>
-          </w:tcPr>
-          <w:p>
-            <w:pPr>
-              <w:spacing w:after="0"/>
-            </w:pPr>
-            <w:r>
-              <w:rPr>
-                <w:rFonts w:ascii="Arial" w:hAnsi="Arial"/>
-                <w:b w:val="0"/>
-                <w:color w:val="111827"/>
-                <w:sz w:val="15"/>
-              </w:rPr>
-              <w:t>Firebase Auth, Firestore, Messaging, Cloud Functions, SQL, stored procedures, views</w:t>
-            </w:r>
-          </w:p>
-        </w:tc>
-      </w:tr>
-      <w:tr>
-        <w:tc>
-          <w:tcPr>
-            <w:tcW w:type="dxa" w:w="2160"/>
-            <w:vAlign w:val="center"/>
-            <w:tcBorders>
-              <w:top w:val="single" w:sz="4" w:color="D9E0EA"/>
-              <w:left w:val="single" w:sz="4" w:color="D9E0EA"/>
-              <w:bottom w:val="single" w:sz="4" w:color="D9E0EA"/>
-              <w:right w:val="single" w:sz="4" w:color="D9E0EA"/>
-            </w:tcBorders>
-            <w:tcMar>
-              <w:top w:w="70" w:type="dxa"/>
-              <w:start w:w="100" w:type="dxa"/>
-              <w:bottom w:w="70" w:type="dxa"/>
-              <w:end w:w="100" w:type="dxa"/>
-            </w:tcMar>
-            <w:shd w:fill="F5F8FC"/>
-          </w:tcPr>
-          <w:p>
-            <w:pPr>
-              <w:spacing w:after="0"/>
-            </w:pPr>
-            <w:r>
-              <w:rPr>
-                <w:rFonts w:ascii="Arial" w:hAnsi="Arial"/>
-                <w:b/>
-                <w:color w:val="0B75D1"/>
-                <w:sz w:val="15"/>
-              </w:rPr>
-              <w:t>Integrations</w:t>
-            </w:r>
-          </w:p>
-        </w:tc>
-        <w:tc>
-          <w:tcPr>
-            <w:tcW w:type="dxa" w:w="7992"/>
-            <w:vAlign w:val="center"/>
-            <w:tcBorders>
-              <w:top w:val="single" w:sz="4" w:color="D9E0EA"/>
-              <w:left w:val="single" w:sz="4" w:color="D9E0EA"/>
-              <w:bottom w:val="single" w:sz="4" w:color="D9E0EA"/>
-              <w:right w:val="single" w:sz="4" w:color="D9E0EA"/>
-            </w:tcBorders>
-            <w:tcMar>
-              <w:top w:w="70" w:type="dxa"/>
-              <w:start w:w="100" w:type="dxa"/>
-              <w:bottom w:w="70" w:type="dxa"/>
-              <w:end w:w="100" w:type="dxa"/>
-            </w:tcMar>
-          </w:tcPr>
-          <w:p>
-            <w:pPr>
-              <w:spacing w:after="0"/>
-            </w:pPr>
-            <w:r>
-              <w:rPr>
-                <w:rFonts w:ascii="Arial" w:hAnsi="Arial"/>
-                <w:b w:val="0"/>
-                <w:color w:val="111827"/>
-                <w:sz w:val="15"/>
-              </w:rPr>
-              <w:t>REST APIs, GraphQL APIs, Google Maps, deep linking, push notifications, in-app purchases</w:t>
-            </w:r>
-          </w:p>
-        </w:tc>
-      </w:tr>
-      <w:tr>
-        <w:tc>
-          <w:tcPr>
-            <w:tcW w:type="dxa" w:w="2160"/>
-            <w:vAlign w:val="center"/>
-            <w:tcBorders>
-              <w:top w:val="single" w:sz="4" w:color="D9E0EA"/>
-              <w:left w:val="single" w:sz="4" w:color="D9E0EA"/>
-              <w:bottom w:val="single" w:sz="4" w:color="D9E0EA"/>
-              <w:right w:val="single" w:sz="4" w:color="D9E0EA"/>
-            </w:tcBorders>
-            <w:tcMar>
-              <w:top w:w="70" w:type="dxa"/>
-              <w:start w:w="100" w:type="dxa"/>
-              <w:bottom w:w="70" w:type="dxa"/>
-              <w:end w:w="100" w:type="dxa"/>
-            </w:tcMar>
-            <w:shd w:fill="F5F8FC"/>
-          </w:tcPr>
-          <w:p>
-            <w:pPr>
-              <w:spacing w:after="0"/>
-            </w:pPr>
-            <w:r>
-              <w:rPr>
-                <w:rFonts w:ascii="Arial" w:hAnsi="Arial"/>
-                <w:b/>
-                <w:color w:val="0B75D1"/>
-                <w:sz w:val="15"/>
-              </w:rPr>
-              <w:t>Security/Delivery</w:t>
-            </w:r>
-          </w:p>
-        </w:tc>
-        <w:tc>
-          <w:tcPr>
-            <w:tcW w:type="dxa" w:w="7992"/>
-            <w:vAlign w:val="center"/>
-            <w:tcBorders>
-              <w:top w:val="single" w:sz="4" w:color="D9E0EA"/>
-              <w:left w:val="single" w:sz="4" w:color="D9E0EA"/>
-              <w:bottom w:val="single" w:sz="4" w:color="D9E0EA"/>
-              <w:right w:val="single" w:sz="4" w:color="D9E0EA"/>
-            </w:tcBorders>
-            <w:tcMar>
-              <w:top w:w="70" w:type="dxa"/>
-              <w:start w:w="100" w:type="dxa"/>
-              <w:bottom w:w="70" w:type="dxa"/>
-              <w:end w:w="100" w:type="dxa"/>
-            </w:tcMar>
-          </w:tcPr>
-          <w:p>
-            <w:pPr>
-              <w:spacing w:after="0"/>
-            </w:pPr>
-            <w:r>
-              <w:rPr>
-                <w:rFonts w:ascii="Arial" w:hAnsi="Arial"/>
-                <w:b w:val="0"/>
-                <w:color w:val="111827"/>
-                <w:sz w:val="15"/>
-              </w:rPr>
-              <w:t>PIN access, role-based access, data encryption, cloud backup, caching, Git, GitLab, GitHub</w:t>
-            </w:r>
-          </w:p>
-        </w:tc>
-      </w:tr>
-    </w:tbl>
+    <w:p>
+      <w:pPr>
+        <w:spacing w:after="22" w:line="252" w:lineRule="auto"/>
+      </w:pPr>
+      <w:r>
+        <w:rPr>
+          <w:rFonts w:ascii="Arial" w:hAnsi="Arial"/>
+          <w:b/>
+          <w:color w:val="0B75D1"/>
+          <w:sz w:val="15"/>
+        </w:rPr>
+        <w:t xml:space="preserve">Mobile: </w:t>
+      </w:r>
+      <w:r>
+        <w:rPr>
+          <w:rFonts w:ascii="Arial" w:hAnsi="Arial"/>
+          <w:b w:val="0"/>
+          <w:color w:val="111827"/>
+          <w:sz w:val="15"/>
+        </w:rPr>
+        <w:t>Flutter, Dart, GetX, Riverpod, BLoC, Patrol tests, Mockito, widget and integration testing</w:t>
+      </w:r>
+    </w:p>
+    <w:p>
+      <w:pPr>
+        <w:spacing w:after="22" w:line="252" w:lineRule="auto"/>
+      </w:pPr>
+      <w:r>
+        <w:rPr>
+          <w:rFonts w:ascii="Arial" w:hAnsi="Arial"/>
+          <w:b/>
+          <w:color w:val="0B75D1"/>
+          <w:sz w:val="15"/>
+        </w:rPr>
+        <w:t xml:space="preserve">Web: </w:t>
+      </w:r>
+      <w:r>
+        <w:rPr>
+          <w:rFonts w:ascii="Arial" w:hAnsi="Arial"/>
+          <w:b w:val="0"/>
+          <w:color w:val="111827"/>
+          <w:sz w:val="15"/>
+        </w:rPr>
+        <w:t>Next.js, TypeScript, React, Prisma, Tailwind CSS, next-intl (i18n), SEO</w:t>
+      </w:r>
+    </w:p>
+    <w:p>
+      <w:pPr>
+        <w:spacing w:after="22" w:line="252" w:lineRule="auto"/>
+      </w:pPr>
+      <w:r>
+        <w:rPr>
+          <w:rFonts w:ascii="Arial" w:hAnsi="Arial"/>
+          <w:b/>
+          <w:color w:val="0B75D1"/>
+          <w:sz w:val="15"/>
+        </w:rPr>
+        <w:t xml:space="preserve">Backend/Data: </w:t>
+      </w:r>
+      <w:r>
+        <w:rPr>
+          <w:rFonts w:ascii="Arial" w:hAnsi="Arial"/>
+          <w:b w:val="0"/>
+          <w:color w:val="111827"/>
+          <w:sz w:val="15"/>
+        </w:rPr>
+        <w:t>Firebase Auth, Firestore, Messaging, Cloud Functions, SQL, stored procedures, views</w:t>
+      </w:r>
+    </w:p>
+    <w:p>
+      <w:pPr>
+        <w:spacing w:after="22" w:line="252" w:lineRule="auto"/>
+      </w:pPr>
+      <w:r>
+        <w:rPr>
+          <w:rFonts w:ascii="Arial" w:hAnsi="Arial"/>
+          <w:b/>
+          <w:color w:val="0B75D1"/>
+          <w:sz w:val="15"/>
+        </w:rPr>
+        <w:t xml:space="preserve">Integrations: </w:t>
+      </w:r>
+      <w:r>
+        <w:rPr>
+          <w:rFonts w:ascii="Arial" w:hAnsi="Arial"/>
+          <w:b w:val="0"/>
+          <w:color w:val="111827"/>
+          <w:sz w:val="15"/>
+        </w:rPr>
+        <w:t>REST APIs, GraphQL APIs, Google Maps, deep linking, push notifications, in-app purchases</w:t>
+      </w:r>
+    </w:p>
+    <w:p>
+      <w:pPr>
+        <w:spacing w:after="22" w:line="252" w:lineRule="auto"/>
+      </w:pPr>
+      <w:r>
+        <w:rPr>
+          <w:rFonts w:ascii="Arial" w:hAnsi="Arial"/>
+          <w:b/>
+          <w:color w:val="0B75D1"/>
+          <w:sz w:val="15"/>
+        </w:rPr>
+        <w:t xml:space="preserve">Security/Delivery: </w:t>
+      </w:r>
+      <w:r>
+        <w:rPr>
+          <w:rFonts w:ascii="Arial" w:hAnsi="Arial"/>
+          <w:b w:val="0"/>
+          <w:color w:val="111827"/>
+          <w:sz w:val="15"/>
+        </w:rPr>
+        <w:t>Patrol automated app testing, PIN access, role-based access, data encryption, cloud backup, caching, Git, GitLab, GitHub</w:t>
+      </w:r>
+    </w:p>
     <w:p>
       <w:pPr>
         <w:keepNext/>
@@ -595,7 +408,87 @@
           <w:color w:val="111827"/>
           <w:sz w:val="17"/>
         </w:rPr>
-        <w:t>Integrated Firebase Auth, Firestore, Analytics, third-party REST APIs, widget tests, and integration tests.</w:t>
+        <w:t>Integrated Firebase Auth, Firestore, Analytics, third-party REST APIs, Patrol automated app tests, widget tests, and integration tests.</w:t>
+      </w:r>
+    </w:p>
+    <w:p>
+      <w:pPr>
+        <w:keepNext/>
+        <w:spacing w:before="112" w:after="18"/>
+      </w:pPr>
+      <w:r>
+        <w:rPr>
+          <w:rFonts w:ascii="Arial" w:hAnsi="Arial"/>
+          <w:b/>
+          <w:color w:val="111827"/>
+          <w:sz w:val="18"/>
+        </w:rPr>
+        <w:t>Freelance Web Developer</w:t>
+      </w:r>
+      <w:r>
+        <w:rPr>
+          <w:rFonts w:ascii="Arial" w:hAnsi="Arial"/>
+          <w:b/>
+          <w:color w:val="0B75D1"/>
+          <w:sz w:val="18"/>
+        </w:rPr>
+        <w:t xml:space="preserve"> | Freelance</w:t>
+      </w:r>
+      <w:r>
+        <w:rPr>
+          <w:rFonts w:ascii="Arial" w:hAnsi="Arial"/>
+          <w:b w:val="0"/>
+          <w:color w:val="525C6C"/>
+          <w:sz w:val="16"/>
+        </w:rPr>
+        <w:t xml:space="preserve"> | Remote</w:t>
+      </w:r>
+    </w:p>
+    <w:p>
+      <w:pPr>
+        <w:keepNext/>
+        <w:spacing w:after="34"/>
+      </w:pPr>
+      <w:r>
+        <w:rPr>
+          <w:rFonts w:ascii="Arial" w:hAnsi="Arial"/>
+          <w:b/>
+          <w:color w:val="525C6C"/>
+          <w:sz w:val="16"/>
+        </w:rPr>
+        <w:t>2025 - Present</w:t>
+      </w:r>
+    </w:p>
+    <w:p>
+      <w:pPr>
+        <w:pStyle w:val="ListBullet"/>
+        <w:spacing w:after="20" w:line="259" w:lineRule="auto"/>
+        <w:ind w:left="317" w:hanging="173"/>
+      </w:pPr>
+      <w:r>
+        <w:rPr>
+          <w:rFonts w:ascii="Arial" w:hAnsi="Arial"/>
+          <w:b w:val="0"/>
+          <w:color w:val="111827"/>
+          <w:sz w:val="17"/>
+        </w:rPr>
+        <w:t>Designed and delivered a bilingual Arabic/English photographer website (Ghassan Ahmad) with seasonal offers, work galleries, WhatsApp booking, and localized SEO.</w:t>
+      </w:r>
+    </w:p>
+    <w:p>
+      <w:pPr>
+        <w:pStyle w:val="ListBullet"/>
+        <w:spacing w:after="20" w:line="259" w:lineRule="auto"/>
+        <w:ind w:left="317" w:hanging="173"/>
+      </w:pPr>
+      <w:r>
+        <w:rPr>
+          <w:rFonts w:ascii="Arial" w:hAnsi="Arial"/>
+          <w:b w:val="0"/>
+          <w:color w:val="111827"/>
+          <w:sz w:val="17"/>
+        </w:rPr>
+        <w:t>Built the full web stack with Next.js, TypeScript, and Prisma, including a database-backed admin dashboard with image uploads and per-locale SEO control.</w:t>
       </w:r>
     </w:p>
     <w:p>
@@ -691,7 +584,7 @@
           <w:color w:val="111827"/>
           <w:sz w:val="17"/>
         </w:rPr>
-        <w:t>Built GetX architectures, SQL views, Firebase Messaging, deep links, GraphQL, REST APIs, and Patrol tests.</w:t>
+        <w:t>Built GetX architectures, SQL views, Firebase Messaging, deep links, GraphQL, REST APIs, and Patrol end-to-end automation tests.</w:t>
       </w:r>
     </w:p>
     <w:p>
@@ -866,7 +759,7 @@
           <w:color w:val="0B75D1"/>
           <w:sz w:val="18"/>
         </w:rPr>
-        <w:t>SELECTED APPLICATIONS</w:t>
+        <w:t>SELECTED PROJECTS</w:t>
       </w:r>
     </w:p>
     <w:p>
@@ -1235,6 +1128,67 @@
         <w:t xml:space="preserve"> | Stores: Play Store, App Store</w:t>
       </w:r>
     </w:p>
+    <w:p>
+      <w:pPr>
+        <w:keepNext/>
+        <w:spacing w:before="56" w:after="15"/>
+      </w:pPr>
+      <w:r>
+        <w:rPr>
+          <w:rFonts w:ascii="Arial" w:hAnsi="Arial"/>
+          <w:b/>
+          <w:color w:val="111827"/>
+          <w:sz w:val="17"/>
+        </w:rPr>
+        <w:t>Ghassan Ahmad</w:t>
+      </w:r>
+      <w:r>
+        <w:rPr>
+          <w:rFonts w:ascii="Arial" w:hAnsi="Arial"/>
+          <w:b/>
+          <w:color w:val="0B75D1"/>
+          <w:sz w:val="17"/>
+        </w:rPr>
+        <w:t xml:space="preserve"> | Photographer Website</w:t>
+      </w:r>
+    </w:p>
+    <w:p>
+      <w:pPr>
+        <w:spacing w:after="15" w:line="252" w:lineRule="auto"/>
+      </w:pPr>
+      <w:r>
+        <w:rPr>
+          <w:rFonts w:ascii="Arial" w:hAnsi="Arial"/>
+          <w:b w:val="0"/>
+          <w:color w:val="111827"/>
+          <w:sz w:val="16"/>
+        </w:rPr>
+        <w:t>Bilingual Arabic/English photographer website with seasonal offers, work galleries, WhatsApp booking, localized SEO, and a database-backed admin dashboard with image uploads.</w:t>
+      </w:r>
+    </w:p>
+    <w:p>
+      <w:pPr>
+        <w:spacing w:after="28"/>
+      </w:pPr>
+      <w:r>
+        <w:rPr>
+          <w:rFonts w:ascii="Arial" w:hAnsi="Arial"/>
+          <w:b/>
+          <w:color w:val="525C6C"/>
+          <w:sz w:val="15"/>
+        </w:rPr>
+        <w:t>Stack: Next.js, TypeScript, Prisma, i18n</w:t>
+      </w:r>
+      <w:r>
+        <w:rPr>
+          <w:rFonts w:ascii="Arial" w:hAnsi="Arial"/>
+          <w:b w:val="0"/>
+          <w:color w:val="525C6C"/>
+          <w:sz w:val="15"/>
+        </w:rPr>
+        <w:t xml:space="preserve"> | Platform: Web (landing site + admin dashboard)</w:t>
+      </w:r>
+    </w:p>
     <w:sectPr>
       <w:pgSz w:w="12240" w:h="15840"/>
       <w:pgMar w:top="490" w:right="720" w:bottom="490" w:left="720" w:header="360" w:footer="360" w:gutter="0"/>

</xml_diff>